<commit_message>
Update pipeline, notebook, figures, and results; remove large raw TCGA files
</commit_message>
<xml_diff>
--- a/results/Top10_Genes.docx
+++ b/results/Top10_Genes.docx
@@ -536,7 +536,7 @@
                 <w:szCs w:val="22"/>
                 <w:color w:val="000000"/>
               </w:rPr>
-              <w:t xml:space="preserve">-3.71</w:t>
+              <w:t xml:space="preserve">-3.79</w:t>
             </w:r>
           </w:p>
         </w:tc>
@@ -589,7 +589,7 @@
                 <w:szCs w:val="22"/>
                 <w:color w:val="000000"/>
               </w:rPr>
-              <w:t xml:space="preserve">2.66</w:t>
+              <w:t xml:space="preserve">2.62</w:t>
             </w:r>
           </w:p>
         </w:tc>
@@ -642,7 +642,7 @@
                 <w:szCs w:val="22"/>
                 <w:color w:val="000000"/>
               </w:rPr>
-              <w:t xml:space="preserve">-25.57</w:t>
+              <w:t xml:space="preserve">-27.50</w:t>
             </w:r>
           </w:p>
         </w:tc>
@@ -695,7 +695,7 @@
                 <w:szCs w:val="22"/>
                 <w:color w:val="000000"/>
               </w:rPr>
-              <w:t xml:space="preserve">1.2e-59</w:t>
+              <w:t xml:space="preserve">7.1e-64</w:t>
             </w:r>
           </w:p>
         </w:tc>
@@ -748,7 +748,7 @@
                 <w:szCs w:val="22"/>
                 <w:color w:val="000000"/>
               </w:rPr>
-              <w:t xml:space="preserve">4.5e-55</w:t>
+              <w:t xml:space="preserve">2.7e-59</w:t>
             </w:r>
           </w:p>
         </w:tc>
@@ -801,7 +801,7 @@
                 <w:szCs w:val="22"/>
                 <w:color w:val="000000"/>
               </w:rPr>
-              <w:t xml:space="preserve">125.11</w:t>
+              <w:t xml:space="preserve">134.71</w:t>
             </w:r>
           </w:p>
         </w:tc>
@@ -913,7 +913,7 @@
                 <w:szCs w:val="22"/>
                 <w:color w:val="000000"/>
               </w:rPr>
-              <w:t xml:space="preserve">5.63</w:t>
+              <w:t xml:space="preserve">5.65</w:t>
             </w:r>
           </w:p>
         </w:tc>
@@ -966,7 +966,7 @@
                 <w:szCs w:val="22"/>
                 <w:color w:val="000000"/>
               </w:rPr>
-              <w:t xml:space="preserve">10.81</w:t>
+              <w:t xml:space="preserve">10.82</w:t>
             </w:r>
           </w:p>
         </w:tc>
@@ -1019,7 +1019,7 @@
                 <w:szCs w:val="22"/>
                 <w:color w:val="000000"/>
               </w:rPr>
-              <w:t xml:space="preserve">24.54</w:t>
+              <w:t xml:space="preserve">22.94</w:t>
             </w:r>
           </w:p>
         </w:tc>
@@ -1072,7 +1072,7 @@
                 <w:szCs w:val="22"/>
                 <w:color w:val="000000"/>
               </w:rPr>
-              <w:t xml:space="preserve">2.8e-57</w:t>
+              <w:t xml:space="preserve">1.8e-53</w:t>
             </w:r>
           </w:p>
         </w:tc>
@@ -1125,7 +1125,7 @@
                 <w:szCs w:val="22"/>
                 <w:color w:val="000000"/>
               </w:rPr>
-              <w:t xml:space="preserve">5.1e-53</w:t>
+              <w:t xml:space="preserve">3.3e-49</w:t>
             </w:r>
           </w:p>
         </w:tc>
@@ -1178,14 +1178,14 @@
                 <w:szCs w:val="22"/>
                 <w:color w:val="000000"/>
               </w:rPr>
-              <w:t xml:space="preserve">119.76</w:t>
+              <w:t xml:space="preserve">111.13</w:t>
             </w:r>
           </w:p>
         </w:tc>
       </w:tr>
       <w:tr>
         <w:trPr>
-          <w:trHeight w:val="569" w:hRule="auto"/>
+          <w:trHeight w:val="570" w:hRule="auto"/>
         </w:trPr>
         body 3
         <w:tc>
@@ -1290,7 +1290,7 @@
                 <w:szCs w:val="22"/>
                 <w:color w:val="000000"/>
               </w:rPr>
-              <w:t xml:space="preserve">-3.91</w:t>
+              <w:t xml:space="preserve">-3.94</w:t>
             </w:r>
           </w:p>
         </w:tc>
@@ -1343,7 +1343,7 @@
                 <w:szCs w:val="22"/>
                 <w:color w:val="000000"/>
               </w:rPr>
-              <w:t xml:space="preserve">9.84</w:t>
+              <w:t xml:space="preserve">9.83</w:t>
             </w:r>
           </w:p>
         </w:tc>
@@ -1396,7 +1396,7 @@
                 <w:szCs w:val="22"/>
                 <w:color w:val="000000"/>
               </w:rPr>
-              <w:t xml:space="preserve">-21.84</w:t>
+              <w:t xml:space="preserve">-22.19</w:t>
             </w:r>
           </w:p>
         </w:tc>
@@ -1449,7 +1449,7 @@
                 <w:szCs w:val="22"/>
                 <w:color w:val="000000"/>
               </w:rPr>
-              <w:t xml:space="preserve">8.0e-51</w:t>
+              <w:t xml:space="preserve">1.2e-51</w:t>
             </w:r>
           </w:p>
         </w:tc>
@@ -1502,7 +1502,7 @@
                 <w:szCs w:val="22"/>
                 <w:color w:val="000000"/>
               </w:rPr>
-              <w:t xml:space="preserve">9.7e-47</w:t>
+              <w:t xml:space="preserve">1.5e-47</w:t>
             </w:r>
           </w:p>
         </w:tc>
@@ -1555,7 +1555,7 @@
                 <w:szCs w:val="22"/>
                 <w:color w:val="000000"/>
               </w:rPr>
-              <w:t xml:space="preserve">105.09</w:t>
+              <w:t xml:space="preserve">106.98</w:t>
             </w:r>
           </w:p>
         </w:tc>
@@ -1614,7 +1614,7 @@
                 <w:szCs w:val="22"/>
                 <w:color w:val="000000"/>
               </w:rPr>
-              <w:t xml:space="preserve">COL10A1</w:t>
+              <w:t xml:space="preserve">VEGFD</w:t>
             </w:r>
           </w:p>
         </w:tc>
@@ -1667,7 +1667,7 @@
                 <w:szCs w:val="22"/>
                 <w:color w:val="000000"/>
               </w:rPr>
-              <w:t xml:space="preserve">6.55</w:t>
+              <w:t xml:space="preserve">-5.97</w:t>
             </w:r>
           </w:p>
         </w:tc>
@@ -1720,7 +1720,7 @@
                 <w:szCs w:val="22"/>
                 <w:color w:val="000000"/>
               </w:rPr>
-              <w:t xml:space="preserve">8.61</w:t>
+              <w:t xml:space="preserve">7.62</w:t>
             </w:r>
           </w:p>
         </w:tc>
@@ -1773,7 +1773,7 @@
                 <w:szCs w:val="22"/>
                 <w:color w:val="000000"/>
               </w:rPr>
-              <w:t xml:space="preserve">21.50</w:t>
+              <w:t xml:space="preserve">-21.98</w:t>
             </w:r>
           </w:p>
         </w:tc>
@@ -1826,7 +1826,7 @@
                 <w:szCs w:val="22"/>
                 <w:color w:val="000000"/>
               </w:rPr>
-              <w:t xml:space="preserve">5.6e-50</w:t>
+              <w:t xml:space="preserve">3.7e-51</w:t>
             </w:r>
           </w:p>
         </w:tc>
@@ -1879,7 +1879,7 @@
                 <w:szCs w:val="22"/>
                 <w:color w:val="000000"/>
               </w:rPr>
-              <w:t xml:space="preserve">5.1e-46</w:t>
+              <w:t xml:space="preserve">3.5e-47</w:t>
             </w:r>
           </w:p>
         </w:tc>
@@ -1932,7 +1932,7 @@
                 <w:szCs w:val="22"/>
                 <w:color w:val="000000"/>
               </w:rPr>
-              <w:t xml:space="preserve">103.16</w:t>
+              <w:t xml:space="preserve">105.83</w:t>
             </w:r>
           </w:p>
         </w:tc>
@@ -1991,7 +1991,7 @@
                 <w:szCs w:val="22"/>
                 <w:color w:val="000000"/>
               </w:rPr>
-              <w:t xml:space="preserve">VEGFD</w:t>
+              <w:t xml:space="preserve">LINC02511</w:t>
             </w:r>
           </w:p>
         </w:tc>
@@ -2044,7 +2044,7 @@
                 <w:szCs w:val="22"/>
                 <w:color w:val="000000"/>
               </w:rPr>
-              <w:t xml:space="preserve">-5.78</w:t>
+              <w:t xml:space="preserve">-4.61</w:t>
             </w:r>
           </w:p>
         </w:tc>
@@ -2097,7 +2097,7 @@
                 <w:szCs w:val="22"/>
                 <w:color w:val="000000"/>
               </w:rPr>
-              <w:t xml:space="preserve">7.72</w:t>
+              <w:t xml:space="preserve">3.99</w:t>
             </w:r>
           </w:p>
         </w:tc>
@@ -2150,7 +2150,7 @@
                 <w:szCs w:val="22"/>
                 <w:color w:val="000000"/>
               </w:rPr>
-              <w:t xml:space="preserve">-20.96</w:t>
+              <w:t xml:space="preserve">-21.28</w:t>
             </w:r>
           </w:p>
         </w:tc>
@@ -2203,7 +2203,7 @@
                 <w:szCs w:val="22"/>
                 <w:color w:val="000000"/>
               </w:rPr>
-              <w:t xml:space="preserve">1.3e-48</w:t>
+              <w:t xml:space="preserve">2.0e-49</w:t>
             </w:r>
           </w:p>
         </w:tc>
@@ -2256,7 +2256,7 @@
                 <w:szCs w:val="22"/>
                 <w:color w:val="000000"/>
               </w:rPr>
-              <w:t xml:space="preserve">9.4e-45</w:t>
+              <w:t xml:space="preserve">1.5e-45</w:t>
             </w:r>
           </w:p>
         </w:tc>
@@ -2309,7 +2309,7 @@
                 <w:szCs w:val="22"/>
                 <w:color w:val="000000"/>
               </w:rPr>
-              <w:t xml:space="preserve">100.05</w:t>
+              <w:t xml:space="preserve">101.89</w:t>
             </w:r>
           </w:p>
         </w:tc>
@@ -2368,7 +2368,7 @@
                 <w:szCs w:val="22"/>
                 <w:color w:val="000000"/>
               </w:rPr>
-              <w:t xml:space="preserve">CPA1</w:t>
+              <w:t xml:space="preserve">CA4</w:t>
             </w:r>
           </w:p>
         </w:tc>
@@ -2421,7 +2421,7 @@
                 <w:szCs w:val="22"/>
                 <w:color w:val="000000"/>
               </w:rPr>
-              <w:t xml:space="preserve">-4.55</w:t>
+              <w:t xml:space="preserve">-6.77</w:t>
             </w:r>
           </w:p>
         </w:tc>
@@ -2474,7 +2474,7 @@
                 <w:szCs w:val="22"/>
                 <w:color w:val="000000"/>
               </w:rPr>
-              <w:t xml:space="preserve">4.22</w:t>
+              <w:t xml:space="preserve">6.35</w:t>
             </w:r>
           </w:p>
         </w:tc>
@@ -2527,7 +2527,7 @@
                 <w:szCs w:val="22"/>
                 <w:color w:val="000000"/>
               </w:rPr>
-              <w:t xml:space="preserve">-20.82</w:t>
+              <w:t xml:space="preserve">-21.17</w:t>
             </w:r>
           </w:p>
         </w:tc>
@@ -2580,7 +2580,7 @@
                 <w:szCs w:val="22"/>
                 <w:color w:val="000000"/>
               </w:rPr>
-              <w:t xml:space="preserve">2.8e-48</w:t>
+              <w:t xml:space="preserve">3.9e-49</w:t>
             </w:r>
           </w:p>
         </w:tc>
@@ -2633,7 +2633,7 @@
                 <w:szCs w:val="22"/>
                 <w:color w:val="000000"/>
               </w:rPr>
-              <w:t xml:space="preserve">1.5e-44</w:t>
+              <w:t xml:space="preserve">2.5e-45</w:t>
             </w:r>
           </w:p>
         </w:tc>
@@ -2686,7 +2686,7 @@
                 <w:szCs w:val="22"/>
                 <w:color w:val="000000"/>
               </w:rPr>
-              <w:t xml:space="preserve">99.30</w:t>
+              <w:t xml:space="preserve">101.23</w:t>
             </w:r>
           </w:p>
         </w:tc>
@@ -2745,7 +2745,7 @@
                 <w:szCs w:val="22"/>
                 <w:color w:val="000000"/>
               </w:rPr>
-              <w:t xml:space="preserve">LRRC3B</w:t>
+              <w:t xml:space="preserve">CPA1</w:t>
             </w:r>
           </w:p>
         </w:tc>
@@ -2798,7 +2798,7 @@
                 <w:szCs w:val="22"/>
                 <w:color w:val="000000"/>
               </w:rPr>
-              <w:t xml:space="preserve">-4.45</w:t>
+              <w:t xml:space="preserve">-4.62</w:t>
             </w:r>
           </w:p>
         </w:tc>
@@ -2851,7 +2851,7 @@
                 <w:szCs w:val="22"/>
                 <w:color w:val="000000"/>
               </w:rPr>
-              <w:t xml:space="preserve">4.55</w:t>
+              <w:t xml:space="preserve">4.19</w:t>
             </w:r>
           </w:p>
         </w:tc>
@@ -2904,7 +2904,7 @@
                 <w:szCs w:val="22"/>
                 <w:color w:val="000000"/>
               </w:rPr>
-              <w:t xml:space="preserve">-20.80</w:t>
+              <w:t xml:space="preserve">-20.83</w:t>
             </w:r>
           </w:p>
         </w:tc>
@@ -2957,7 +2957,7 @@
                 <w:szCs w:val="22"/>
                 <w:color w:val="000000"/>
               </w:rPr>
-              <w:t xml:space="preserve">3.2e-48</w:t>
+              <w:t xml:space="preserve">2.7e-48</w:t>
             </w:r>
           </w:p>
         </w:tc>
@@ -3063,7 +3063,7 @@
                 <w:szCs w:val="22"/>
                 <w:color w:val="000000"/>
               </w:rPr>
-              <w:t xml:space="preserve">99.16</w:t>
+              <w:t xml:space="preserve">99.31</w:t>
             </w:r>
           </w:p>
         </w:tc>
@@ -3122,7 +3122,7 @@
                 <w:szCs w:val="22"/>
                 <w:color w:val="000000"/>
               </w:rPr>
-              <w:t xml:space="preserve">CA4</w:t>
+              <w:t xml:space="preserve">COL25A1</w:t>
             </w:r>
           </w:p>
         </w:tc>
@@ -3175,7 +3175,7 @@
                 <w:szCs w:val="22"/>
                 <w:color w:val="000000"/>
               </w:rPr>
-              <w:t xml:space="preserve">-6.65</w:t>
+              <w:t xml:space="preserve">-3.62</w:t>
             </w:r>
           </w:p>
         </w:tc>
@@ -3228,7 +3228,7 @@
                 <w:szCs w:val="22"/>
                 <w:color w:val="000000"/>
               </w:rPr>
-              <w:t xml:space="preserve">6.41</w:t>
+              <w:t xml:space="preserve">6.48</w:t>
             </w:r>
           </w:p>
         </w:tc>
@@ -3281,7 +3281,7 @@
                 <w:szCs w:val="22"/>
                 <w:color w:val="000000"/>
               </w:rPr>
-              <w:t xml:space="preserve">-20.80</w:t>
+              <w:t xml:space="preserve">-20.73</w:t>
             </w:r>
           </w:p>
         </w:tc>
@@ -3334,7 +3334,7 @@
                 <w:szCs w:val="22"/>
                 <w:color w:val="000000"/>
               </w:rPr>
-              <w:t xml:space="preserve">3.3e-48</w:t>
+              <w:t xml:space="preserve">4.8e-48</w:t>
             </w:r>
           </w:p>
         </w:tc>
@@ -3387,7 +3387,7 @@
                 <w:szCs w:val="22"/>
                 <w:color w:val="000000"/>
               </w:rPr>
-              <w:t xml:space="preserve">1.5e-44</w:t>
+              <w:t xml:space="preserve">2.2e-44</w:t>
             </w:r>
           </w:p>
         </w:tc>
@@ -3440,7 +3440,7 @@
                 <w:szCs w:val="22"/>
                 <w:color w:val="000000"/>
               </w:rPr>
-              <w:t xml:space="preserve">99.13</w:t>
+              <w:t xml:space="preserve">98.75</w:t>
             </w:r>
           </w:p>
         </w:tc>
@@ -3499,7 +3499,7 @@
                 <w:szCs w:val="22"/>
                 <w:color w:val="000000"/>
               </w:rPr>
-              <w:t xml:space="preserve">PGM5-AS1</w:t>
+              <w:t xml:space="preserve">LRRC3B</w:t>
             </w:r>
           </w:p>
         </w:tc>
@@ -3552,7 +3552,7 @@
                 <w:szCs w:val="22"/>
                 <w:color w:val="000000"/>
               </w:rPr>
-              <w:t xml:space="preserve">-4.14</w:t>
+              <w:t xml:space="preserve">-4.52</w:t>
             </w:r>
           </w:p>
         </w:tc>
@@ -3605,7 +3605,7 @@
                 <w:szCs w:val="22"/>
                 <w:color w:val="000000"/>
               </w:rPr>
-              <w:t xml:space="preserve">3.47</w:t>
+              <w:t xml:space="preserve">4.51</w:t>
             </w:r>
           </w:p>
         </w:tc>
@@ -3658,7 +3658,7 @@
                 <w:szCs w:val="22"/>
                 <w:color w:val="000000"/>
               </w:rPr>
-              <w:t xml:space="preserve">-20.63</w:t>
+              <w:t xml:space="preserve">-20.72</w:t>
             </w:r>
           </w:p>
         </w:tc>
@@ -3711,7 +3711,7 @@
                 <w:szCs w:val="22"/>
                 <w:color w:val="000000"/>
               </w:rPr>
-              <w:t xml:space="preserve">8.6e-48</w:t>
+              <w:t xml:space="preserve">5.3e-48</w:t>
             </w:r>
           </w:p>
         </w:tc>
@@ -3764,7 +3764,7 @@
                 <w:szCs w:val="22"/>
                 <w:color w:val="000000"/>
               </w:rPr>
-              <w:t xml:space="preserve">3.5e-44</w:t>
+              <w:t xml:space="preserve">2.2e-44</w:t>
             </w:r>
           </w:p>
         </w:tc>
@@ -3817,14 +3817,14 @@
                 <w:szCs w:val="22"/>
                 <w:color w:val="000000"/>
               </w:rPr>
-              <w:t xml:space="preserve">98.18</w:t>
+              <w:t xml:space="preserve">98.65</w:t>
             </w:r>
           </w:p>
         </w:tc>
       </w:tr>
       <w:tr>
         <w:trPr>
-          <w:trHeight w:val="573" w:hRule="auto"/>
+          <w:trHeight w:val="577" w:hRule="auto"/>
         </w:trPr>
         body10
         <w:tc>
@@ -3876,7 +3876,7 @@
                 <w:szCs w:val="22"/>
                 <w:color w:val="000000"/>
               </w:rPr>
-              <w:t xml:space="preserve">HIF3A</w:t>
+              <w:t xml:space="preserve">CAVIN2</w:t>
             </w:r>
           </w:p>
         </w:tc>
@@ -3929,7 +3929,7 @@
                 <w:szCs w:val="22"/>
                 <w:color w:val="000000"/>
               </w:rPr>
-              <w:t xml:space="preserve">-4.98</w:t>
+              <w:t xml:space="preserve">-4.66</w:t>
             </w:r>
           </w:p>
         </w:tc>
@@ -3982,7 +3982,7 @@
                 <w:szCs w:val="22"/>
                 <w:color w:val="000000"/>
               </w:rPr>
-              <w:t xml:space="preserve">6.86</w:t>
+              <w:t xml:space="preserve">10.33</w:t>
             </w:r>
           </w:p>
         </w:tc>
@@ -4035,7 +4035,7 @@
                 <w:szCs w:val="22"/>
                 <w:color w:val="000000"/>
               </w:rPr>
-              <w:t xml:space="preserve">-20.60</w:t>
+              <w:t xml:space="preserve">-20.35</w:t>
             </w:r>
           </w:p>
         </w:tc>
@@ -4088,7 +4088,7 @@
                 <w:szCs w:val="22"/>
                 <w:color w:val="000000"/>
               </w:rPr>
-              <w:t xml:space="preserve">1.0e-47</w:t>
+              <w:t xml:space="preserve">4.4e-47</w:t>
             </w:r>
           </w:p>
         </w:tc>
@@ -4141,7 +4141,7 @@
                 <w:szCs w:val="22"/>
                 <w:color w:val="000000"/>
               </w:rPr>
-              <w:t xml:space="preserve">3.7e-44</w:t>
+              <w:t xml:space="preserve">1.6e-43</w:t>
             </w:r>
           </w:p>
         </w:tc>
@@ -4194,7 +4194,7 @@
                 <w:szCs w:val="22"/>
                 <w:color w:val="000000"/>
               </w:rPr>
-              <w:t xml:space="preserve">98.00</w:t>
+              <w:t xml:space="preserve">96.55</w:t>
             </w:r>
           </w:p>
         </w:tc>

</xml_diff>